<commit_message>
Add citations and correct Zaleznik issue number
Co-Authored-By: Claude Sonnet 5.5 <noreply@anthropic.com>
Claude-Session: https://claude.ai/code/session_013tCbrTUp4uLgahyb924VhZ
</commit_message>
<xml_diff>
--- a/Leadership_Reflection_and_Plan_Final.docx
+++ b/Leadership_Reflection_and_Plan_Final.docx
@@ -35,7 +35,7 @@
           <w:rFonts w:eastAsia="Times New Roman" w:cs="Arial"/>
           <w:szCs w:val="24"/>
         </w:rPr>
-        <w:t>In Activity 1, social skills were my strongest emotional intelligence component and self-awareness was my weakest. In a group project, I missed a teammate’s concern that tasks were shared unevenly. They carried extra work, and we lost the chance to fix it early. My thesis is that I build rapport well but do not always notice how my actions affect others.</w:t>
+        <w:t>In Activity 1, social skills were my strongest emotional intelligence component (Goleman, 1998) and self-awareness was my weakest. In a group project, I missed a teammate’s concern that tasks were shared unevenly. They carried extra work, and we lost the chance to fix it early. My thesis is that I build rapport well but do not always notice how my actions affect others.</w:t>
       </w:r>
     </w:p>
     <w:p>
@@ -93,8 +93,7 @@
           <w:rFonts w:eastAsia="Times New Roman" w:cs="Arial"/>
           <w:szCs w:val="24"/>
         </w:rPr>
-        <w:lastRenderedPageBreak/>
-        <w:t>achieves little unless I act on it. I now see empathy as information for better decisions, not just being kind.</w:t>
+        <w:t>achieves little unless I act on it. I now see empathy as information for better decisions, not just being kind (Goleman, 1998).</w:t>
       </w:r>
     </w:p>
     <w:p>
@@ -255,7 +254,7 @@
           <w:rFonts w:eastAsia="Times New Roman" w:cs="Arial"/>
           <w:szCs w:val="24"/>
         </w:rPr>
-        <w:t>I chose Nooyi, former PepsiCo chief executive, against three criteria: documented leadership philosophy (Nooyi, 2021); an intersectional position (gender, ethnicity, migration); and a record with both achievement and criticism, which allows evaluation, not admiration. I rejected Nadella to avoid overlap, and because gender does not apply to him.</w:t>
+        <w:t>I chose Nooyi, former PepsiCo chief executive, against three criteria: documented leadership philosophy (Nooyi, 2021); an intersectional position (gender, ethnicity, migration); and a record with both achievement and criticism (Sonnenfeld, 2018; Hegde, 2026), which allows evaluation, not admiration. I rejected Nadella to avoid overlap, and because gender does not apply to him.</w:t>
       </w:r>
     </w:p>
     <w:p>
@@ -914,7 +913,7 @@
           <w:rFonts w:cs="Arial"/>
           <w:szCs w:val="24"/>
         </w:rPr>
-        <w:t>, 55(5), pp. 67–78.</w:t>
+        <w:t>, 55(3), pp. 67–78.</w:t>
       </w:r>
     </w:p>
     <w:p>

</xml_diff>